<commit_message>
Checkpoint 2: planted answers and pilot pack rendered and critiqued; critique fixes; renderer, numbers and CSV improvements
</commit_message>
<xml_diff>
--- a/output/archive/BrindlewytheData/Studies/2021/BW21_0453/Proposal/BW21_0453_Quote_revA.docx
+++ b/output/archive/BrindlewytheData/Studies/2021/BW21_0453/Proposal/BW21_0453_Quote_revA.docx
@@ -47,6 +47,7 @@
     <w:p>
       <w:pPr>
         <w:pStyle w:val="Heading1"/>
+        <w:keepNext/>
       </w:pPr>
       <w:r>
         <w:t>1 Introduction</w:t>
@@ -54,7 +55,7 @@
     </w:p>
     <w:p>
       <w:r>
-        <w:t>Brindlewythe Biosciences is pleased to quote for the following screening work. This document responds to the request from Avernelwick Pharmaceuticals Ltd for work on 42 compounds from the Avernelwick aminopyrimidine regioisomer screening set.</w:t>
+        <w:t>Brindlewythe Biosciences is pleased to quote for the screening work below. This proposal responds to the request from Avernelwick Pharmaceuticals Ltd for work on 42 compounds from the Avernelwick aminopyrimidine regioisomer screening set.</w:t>
       </w:r>
     </w:p>
     <w:p>
@@ -65,6 +66,7 @@
     <w:p>
       <w:pPr>
         <w:pStyle w:val="Heading1"/>
+        <w:keepNext/>
       </w:pPr>
       <w:r>
         <w:t>2 Scope of work</w:t>
@@ -72,12 +74,14 @@
     </w:p>
     <w:p>
       <w:r>
-        <w:t>42 compounds, supplied by Avernelwick Pharmaceuticals Ltd as 10 mM DMSO solutions (minimum 40 µL each) in a single test lot.</w:t>
+        <w:t>42 compounds, to be supplied by Avernelwick Pharmaceuticals Ltd as 10 mM DMSO solutions (minimum 40 µL each) in a single test lot.</w:t>
       </w:r>
     </w:p>
     <w:p>
       <w:pPr>
         <w:pStyle w:val="ListBullet"/>
+        <w:keepNext/>
+        <w:keepLines/>
       </w:pPr>
       <w:r>
         <w:t>hERG automated patch clamp: 6-point concentration response (top 30 µM), n≥2 cells per compound, E-4031 control</w:t>
@@ -86,6 +90,8 @@
     <w:p>
       <w:pPr>
         <w:pStyle w:val="ListBullet"/>
+        <w:keepNext/>
+        <w:keepLines/>
       </w:pPr>
       <w:r>
         <w:t>5-isoform CYP panel: CYP1A2, 2C9, 2C19, 2D6 and 3A4 at 10 µM in duplicate, probe substrates by LC-MS/MS</w:t>
@@ -94,14 +100,16 @@
     <w:p>
       <w:pPr>
         <w:pStyle w:val="ListBullet"/>
+        <w:keepLines/>
       </w:pPr>
       <w:r>
-        <w:t>3A4 concentration response: 7-point IC50 for compounds above 50% CYP3A4 inhibition (included for up to 10 compounds)</w:t>
+        <w:t>3A4 concentration response: 7-point CYP3A4 IC50 for all 42 compounds (midazolam probe)</w:t>
       </w:r>
     </w:p>
     <w:p>
       <w:pPr>
         <w:pStyle w:val="Heading1"/>
+        <w:keepNext/>
       </w:pPr>
       <w:r>
         <w:t>3 Study design</w:t>
@@ -109,12 +117,13 @@
     </w:p>
     <w:p>
       <w:r>
-        <w:t>Methods follow our standard procedures, summarised below. Any deviation is agreed with the client before testing.</w:t>
+        <w:t>The work will follow our standard procedures, summarised below. Any deviation will be agreed with the client before testing.</w:t>
       </w:r>
     </w:p>
     <w:p>
       <w:pPr>
         <w:pStyle w:val="Heading2"/>
+        <w:keepNext/>
       </w:pPr>
       <w:r>
         <w:t>hERG automated patch clamp</w:t>
@@ -122,12 +131,19 @@
     </w:p>
     <w:p>
       <w:r>
-        <w:t>HEK293 cells stably expressing hERG (Kv11.1) were recorded in whole-cell configuration on a 16-channel automated patch clamp platform at room temperature. Cells were held at -80 mV, depolarised to +40 mV for 2 s and repolarised to -50 mV for 2 s to elicit the tail current, at 0.1 Hz. Each compound was applied cumulatively at 0.12, 0.37, 1.1, 3.3, 10 and 30 µM (0.3% DMSO final), with 3-5 minutes per concentration.</w:t>
+        <w:t>HEK293 cells stably expressing hERG (Kv11.1) will be recorded in whole-cell configuration on a 16-channel automated patch clamp platform at room temperature. Cells are held at -80 mV, depolarised to +40 mV for 2 s and repolarised to -50 mV for 2 s to elicit the tail current, at 0.1 Hz. Each compound will be applied cumulatively at 0.12, 0.37, 1.1, 3.3, 10 and 30 µM (0.3% DMSO final). Each concentration is held until the tail-current block reaches a steady state (change below 5% over the last three sweeps), with a minimum of 3 and a maximum of 8 minutes; compounds still drifting at 8 minutes are flagged as slow-onset.</w:t>
+      </w:r>
+    </w:p>
+    <w:p>
+      <w:r>
+        <w:t>E-4031 is run as a separate 6-point concentration response (1-300 nM) on every run.</w:t>
       </w:r>
     </w:p>
     <w:p>
       <w:pPr>
         <w:pStyle w:val="ListBullet"/>
+        <w:keepNext/>
+        <w:keepLines/>
       </w:pPr>
       <w:r>
         <w:t>Plate acceptance: seal resistance ≥500 MΩ before break-in and ≥200 MΩ throughout</w:t>
@@ -136,30 +152,46 @@
     <w:p>
       <w:pPr>
         <w:pStyle w:val="ListBullet"/>
+        <w:keepNext/>
+        <w:keepLines/>
       </w:pPr>
       <w:r>
-        <w:t>Tail current amplitude ≥200 pA at baseline; run-down ≤10% over the vehicle period</w:t>
+        <w:t>Tail current ≥200 pA at baseline; run-down ≤10% over the vehicle period</w:t>
       </w:r>
     </w:p>
     <w:p>
       <w:pPr>
         <w:pStyle w:val="ListBullet"/>
+        <w:keepNext/>
+        <w:keepLines/>
       </w:pPr>
       <w:r>
-        <w:t>Positive control E-4031 on every run; IC50 must fall within 5-50 nM</w:t>
+        <w:t>E-4031 IC50 within 5-50 nM; runs outside this range are rejected and repeated</w:t>
       </w:r>
     </w:p>
     <w:p>
       <w:pPr>
         <w:pStyle w:val="ListBullet"/>
+        <w:keepNext/>
+        <w:keepLines/>
       </w:pPr>
       <w:r>
-        <w:t>IC50 from a four-parameter logistic fit of mean tail-current inhibition; n≥2 cells per compound</w:t>
+        <w:t>IC50 fitted per cell (four-parameter logistic); the compound IC50 is the geometric mean of finite cell IC50s when these are the majority of accepted cells, otherwise reported as &gt;30 µM</w:t>
+      </w:r>
+    </w:p>
+    <w:p>
+      <w:pPr>
+        <w:pStyle w:val="ListBullet"/>
+        <w:keepLines/>
+      </w:pPr>
+      <w:r>
+        <w:t>Where precipitation is seen at 30 µM, that concentration is excluded and the highest evaluable concentration is reported</w:t>
       </w:r>
     </w:p>
     <w:p>
       <w:pPr>
         <w:pStyle w:val="Heading2"/>
+        <w:keepNext/>
       </w:pPr>
       <w:r>
         <w:t>5-isoform CYP panel</w:t>
@@ -167,10 +199,13 @@
     </w:p>
     <w:p>
       <w:r>
-        <w:t>Pooled human liver microsomes (0.1 mg/mL protein) were incubated with each compound at 10 µM and an isoform-selective probe substrate at approximately Km, in duplicate, for 10 minutes at 37 °C after NADPH addition. Metabolite formation was measured by LC-MS/MS against vehicle (0.1% DMSO) incubations.</w:t>
+        <w:t>Pooled human liver microsomes (0.1 mg/mL protein) will be incubated with each compound at 10 µM and an isoform-selective probe substrate at approximately Km, in duplicate, for 10 minutes at 37 °C after NADPH addition. Metabolite formation is measured by LC-MS/MS against vehicle (0.1% DMSO) incubations; the lower limit of quantitation of each metabolite is at least 20-fold below the vehicle signal.</w:t>
       </w:r>
     </w:p>
     <w:p>
+      <w:pPr>
+        <w:keepNext/>
+      </w:pPr>
       <w:r>
         <w:rPr>
           <w:b/>
@@ -198,6 +233,9 @@
             <w:shd w:val="clear" w:color="auto" w:fill="183C4C"/>
           </w:tcPr>
           <w:p>
+            <w:pPr>
+              <w:keepNext/>
+            </w:pPr>
             <w:r>
               <w:rPr>
                 <w:b/>
@@ -214,6 +252,9 @@
             <w:shd w:val="clear" w:color="auto" w:fill="183C4C"/>
           </w:tcPr>
           <w:p>
+            <w:pPr>
+              <w:keepNext/>
+            </w:pPr>
             <w:r>
               <w:rPr>
                 <w:b/>
@@ -230,6 +271,9 @@
             <w:shd w:val="clear" w:color="auto" w:fill="183C4C"/>
           </w:tcPr>
           <w:p>
+            <w:pPr>
+              <w:keepNext/>
+            </w:pPr>
             <w:r>
               <w:rPr>
                 <w:b/>
@@ -246,6 +290,9 @@
             <w:shd w:val="clear" w:color="auto" w:fill="183C4C"/>
           </w:tcPr>
           <w:p>
+            <w:pPr>
+              <w:keepNext/>
+            </w:pPr>
             <w:r>
               <w:rPr>
                 <w:b/>
@@ -263,6 +310,9 @@
             <w:tcW w:type="dxa" w:w="2353"/>
           </w:tcPr>
           <w:p>
+            <w:pPr>
+              <w:keepNext/>
+            </w:pPr>
             <w:r>
               <w:rPr>
                 <w:sz w:val="18"/>
@@ -276,6 +326,9 @@
             <w:tcW w:type="dxa" w:w="2353"/>
           </w:tcPr>
           <w:p>
+            <w:pPr>
+              <w:keepNext/>
+            </w:pPr>
             <w:r>
               <w:rPr>
                 <w:sz w:val="18"/>
@@ -289,6 +342,9 @@
             <w:tcW w:type="dxa" w:w="2353"/>
           </w:tcPr>
           <w:p>
+            <w:pPr>
+              <w:keepNext/>
+            </w:pPr>
             <w:r>
               <w:rPr>
                 <w:sz w:val="18"/>
@@ -302,6 +358,9 @@
             <w:tcW w:type="dxa" w:w="2353"/>
           </w:tcPr>
           <w:p>
+            <w:pPr>
+              <w:keepNext/>
+            </w:pPr>
             <w:r>
               <w:rPr>
                 <w:sz w:val="18"/>
@@ -317,6 +376,9 @@
             <w:tcW w:type="dxa" w:w="2353"/>
           </w:tcPr>
           <w:p>
+            <w:pPr>
+              <w:keepNext/>
+            </w:pPr>
             <w:r>
               <w:rPr>
                 <w:sz w:val="18"/>
@@ -330,6 +392,9 @@
             <w:tcW w:type="dxa" w:w="2353"/>
           </w:tcPr>
           <w:p>
+            <w:pPr>
+              <w:keepNext/>
+            </w:pPr>
             <w:r>
               <w:rPr>
                 <w:sz w:val="18"/>
@@ -343,6 +408,9 @@
             <w:tcW w:type="dxa" w:w="2353"/>
           </w:tcPr>
           <w:p>
+            <w:pPr>
+              <w:keepNext/>
+            </w:pPr>
             <w:r>
               <w:rPr>
                 <w:sz w:val="18"/>
@@ -356,6 +424,9 @@
             <w:tcW w:type="dxa" w:w="2353"/>
           </w:tcPr>
           <w:p>
+            <w:pPr>
+              <w:keepNext/>
+            </w:pPr>
             <w:r>
               <w:rPr>
                 <w:sz w:val="18"/>
@@ -371,6 +442,9 @@
             <w:tcW w:type="dxa" w:w="2353"/>
           </w:tcPr>
           <w:p>
+            <w:pPr>
+              <w:keepNext/>
+            </w:pPr>
             <w:r>
               <w:rPr>
                 <w:sz w:val="18"/>
@@ -384,6 +458,9 @@
             <w:tcW w:type="dxa" w:w="2353"/>
           </w:tcPr>
           <w:p>
+            <w:pPr>
+              <w:keepNext/>
+            </w:pPr>
             <w:r>
               <w:rPr>
                 <w:sz w:val="18"/>
@@ -397,6 +474,9 @@
             <w:tcW w:type="dxa" w:w="2353"/>
           </w:tcPr>
           <w:p>
+            <w:pPr>
+              <w:keepNext/>
+            </w:pPr>
             <w:r>
               <w:rPr>
                 <w:sz w:val="18"/>
@@ -410,6 +490,9 @@
             <w:tcW w:type="dxa" w:w="2353"/>
           </w:tcPr>
           <w:p>
+            <w:pPr>
+              <w:keepNext/>
+            </w:pPr>
             <w:r>
               <w:rPr>
                 <w:sz w:val="18"/>
@@ -425,6 +508,9 @@
             <w:tcW w:type="dxa" w:w="2353"/>
           </w:tcPr>
           <w:p>
+            <w:pPr>
+              <w:keepNext/>
+            </w:pPr>
             <w:r>
               <w:rPr>
                 <w:sz w:val="18"/>
@@ -438,6 +524,9 @@
             <w:tcW w:type="dxa" w:w="2353"/>
           </w:tcPr>
           <w:p>
+            <w:pPr>
+              <w:keepNext/>
+            </w:pPr>
             <w:r>
               <w:rPr>
                 <w:sz w:val="18"/>
@@ -451,6 +540,9 @@
             <w:tcW w:type="dxa" w:w="2353"/>
           </w:tcPr>
           <w:p>
+            <w:pPr>
+              <w:keepNext/>
+            </w:pPr>
             <w:r>
               <w:rPr>
                 <w:sz w:val="18"/>
@@ -464,6 +556,9 @@
             <w:tcW w:type="dxa" w:w="2353"/>
           </w:tcPr>
           <w:p>
+            <w:pPr>
+              <w:keepNext/>
+            </w:pPr>
             <w:r>
               <w:rPr>
                 <w:sz w:val="18"/>
@@ -531,12 +626,13 @@
     <w:p/>
     <w:p>
       <w:r>
-        <w:t>Results are reported as mean percent inhibition relative to vehicle. Values above 50% at 10 µM are flagged for follow-up; small negative values indicate no inhibition.</w:t>
+        <w:t>Positive controls are run as 7-point concentration responses on every run. Furafylline and ticlopidine (mechanism-based inhibitors) are preincubated with microsomes and NADPH for 15 minutes before probe addition. A run is accepted when each control IC50 falls within 0.5-2 times the laboratory historical mean. Results are reported as mean percent inhibition relative to vehicle; values above 50% at 10 µM are flagged, and small negative values indicate no inhibition.</w:t>
       </w:r>
     </w:p>
     <w:p>
       <w:pPr>
         <w:pStyle w:val="Heading2"/>
+        <w:keepNext/>
       </w:pPr>
       <w:r>
         <w:t>3A4 concentration response</w:t>
@@ -544,12 +640,13 @@
     </w:p>
     <w:p>
       <w:r>
-        <w:t>Compounds were run in a 7-point concentration response (top concentration 50 µM, 3-fold dilutions) against CYP3A4 with midazolam or testosterone as probe; ketoconazole was the positive control.</w:t>
+        <w:t>All compounds will be run in a 7-point CYP3A4 concentration response (top concentration 50 µM, 3-fold dilutions) using midazolam 1'-hydroxylation as the probe, with ketoconazole on every plate. A single probe is used so that IC50s are comparable across the set; substrate-dependent differences are outside the scope.</w:t>
       </w:r>
     </w:p>
     <w:p>
       <w:pPr>
         <w:pStyle w:val="Heading1"/>
+        <w:keepNext/>
       </w:pPr>
       <w:r>
         <w:t>4 Deliverables</w:t>
@@ -558,14 +655,18 @@
     <w:p>
       <w:pPr>
         <w:pStyle w:val="ListBullet"/>
+        <w:keepNext/>
+        <w:keepLines/>
       </w:pPr>
       <w:r>
-        <w:t>Results workbook (run sheets with compound-level data and a study summary sheet)</w:t>
+        <w:t>Results workbook (run sheets with compound-level data, control results and a study summary sheet)</w:t>
       </w:r>
     </w:p>
     <w:p>
       <w:pPr>
         <w:pStyle w:val="ListBullet"/>
+        <w:keepNext/>
+        <w:keepLines/>
       </w:pPr>
       <w:r>
         <w:t>Final report (PDF) with methods, control results and interpretation</w:t>
@@ -574,6 +675,7 @@
     <w:p>
       <w:pPr>
         <w:pStyle w:val="ListBullet"/>
+        <w:keepLines/>
       </w:pPr>
       <w:r>
         <w:t>Raw traces and instrument files on request</w:t>
@@ -582,6 +684,7 @@
     <w:p>
       <w:pPr>
         <w:pStyle w:val="Heading1"/>
+        <w:keepNext/>
       </w:pPr>
       <w:r>
         <w:t>5 Timeline</w:t>
@@ -595,12 +698,16 @@
     <w:p>
       <w:pPr>
         <w:pStyle w:val="Heading1"/>
+        <w:keepNext/>
       </w:pPr>
       <w:r>
         <w:t>6 Price</w:t>
       </w:r>
     </w:p>
     <w:p>
+      <w:pPr>
+        <w:keepNext/>
+      </w:pPr>
       <w:r>
         <w:rPr>
           <w:b/>
@@ -628,6 +735,9 @@
             <w:shd w:val="clear" w:color="auto" w:fill="183C4C"/>
           </w:tcPr>
           <w:p>
+            <w:pPr>
+              <w:keepNext/>
+            </w:pPr>
             <w:r>
               <w:rPr>
                 <w:b/>
@@ -644,6 +754,9 @@
             <w:shd w:val="clear" w:color="auto" w:fill="183C4C"/>
           </w:tcPr>
           <w:p>
+            <w:pPr>
+              <w:keepNext/>
+            </w:pPr>
             <w:r>
               <w:rPr>
                 <w:b/>
@@ -660,6 +773,9 @@
             <w:shd w:val="clear" w:color="auto" w:fill="183C4C"/>
           </w:tcPr>
           <w:p>
+            <w:pPr>
+              <w:keepNext/>
+            </w:pPr>
             <w:r>
               <w:rPr>
                 <w:b/>
@@ -676,6 +792,9 @@
             <w:shd w:val="clear" w:color="auto" w:fill="183C4C"/>
           </w:tcPr>
           <w:p>
+            <w:pPr>
+              <w:keepNext/>
+            </w:pPr>
             <w:r>
               <w:rPr>
                 <w:b/>
@@ -693,6 +812,9 @@
             <w:tcW w:type="dxa" w:w="2353"/>
           </w:tcPr>
           <w:p>
+            <w:pPr>
+              <w:keepNext/>
+            </w:pPr>
             <w:r>
               <w:rPr>
                 <w:sz w:val="18"/>
@@ -706,6 +828,9 @@
             <w:tcW w:type="dxa" w:w="2353"/>
           </w:tcPr>
           <w:p>
+            <w:pPr>
+              <w:keepNext/>
+            </w:pPr>
             <w:r>
               <w:rPr>
                 <w:sz w:val="18"/>
@@ -719,11 +844,14 @@
             <w:tcW w:type="dxa" w:w="2353"/>
           </w:tcPr>
           <w:p>
+            <w:pPr>
+              <w:keepNext/>
+            </w:pPr>
             <w:r>
               <w:rPr>
                 <w:sz w:val="18"/>
               </w:rPr>
-              <w:t>£220</w:t>
+              <w:t>£215</w:t>
             </w:r>
           </w:p>
         </w:tc>
@@ -732,11 +860,14 @@
             <w:tcW w:type="dxa" w:w="2353"/>
           </w:tcPr>
           <w:p>
+            <w:pPr>
+              <w:keepNext/>
+            </w:pPr>
             <w:r>
               <w:rPr>
                 <w:sz w:val="18"/>
               </w:rPr>
-              <w:t>£9,240</w:t>
+              <w:t>£9,030</w:t>
             </w:r>
           </w:p>
         </w:tc>
@@ -747,6 +878,9 @@
             <w:tcW w:type="dxa" w:w="2353"/>
           </w:tcPr>
           <w:p>
+            <w:pPr>
+              <w:keepNext/>
+            </w:pPr>
             <w:r>
               <w:rPr>
                 <w:sz w:val="18"/>
@@ -760,6 +894,9 @@
             <w:tcW w:type="dxa" w:w="2353"/>
           </w:tcPr>
           <w:p>
+            <w:pPr>
+              <w:keepNext/>
+            </w:pPr>
             <w:r>
               <w:rPr>
                 <w:sz w:val="18"/>
@@ -773,6 +910,9 @@
             <w:tcW w:type="dxa" w:w="2353"/>
           </w:tcPr>
           <w:p>
+            <w:pPr>
+              <w:keepNext/>
+            </w:pPr>
             <w:r>
               <w:rPr>
                 <w:sz w:val="18"/>
@@ -786,6 +926,9 @@
             <w:tcW w:type="dxa" w:w="2353"/>
           </w:tcPr>
           <w:p>
+            <w:pPr>
+              <w:keepNext/>
+            </w:pPr>
             <w:r>
               <w:rPr>
                 <w:sz w:val="18"/>
@@ -801,6 +944,9 @@
             <w:tcW w:type="dxa" w:w="2353"/>
           </w:tcPr>
           <w:p>
+            <w:pPr>
+              <w:keepNext/>
+            </w:pPr>
             <w:r>
               <w:rPr>
                 <w:sz w:val="18"/>
@@ -814,6 +960,9 @@
             <w:tcW w:type="dxa" w:w="2353"/>
           </w:tcPr>
           <w:p>
+            <w:pPr>
+              <w:keepNext/>
+            </w:pPr>
             <w:r>
               <w:rPr>
                 <w:sz w:val="18"/>
@@ -827,11 +976,14 @@
             <w:tcW w:type="dxa" w:w="2353"/>
           </w:tcPr>
           <w:p>
+            <w:pPr>
+              <w:keepNext/>
+            </w:pPr>
             <w:r>
               <w:rPr>
                 <w:sz w:val="18"/>
               </w:rPr>
-              <w:t>£38.57</w:t>
+              <w:t>£43.57</w:t>
             </w:r>
           </w:p>
         </w:tc>
@@ -840,11 +992,14 @@
             <w:tcW w:type="dxa" w:w="2353"/>
           </w:tcPr>
           <w:p>
+            <w:pPr>
+              <w:keepNext/>
+            </w:pPr>
             <w:r>
               <w:rPr>
                 <w:sz w:val="18"/>
               </w:rPr>
-              <w:t>£1,620</w:t>
+              <w:t>£1,830</w:t>
             </w:r>
           </w:p>
         </w:tc>
@@ -911,6 +1066,7 @@
     <w:p>
       <w:pPr>
         <w:pStyle w:val="Heading1"/>
+        <w:keepNext/>
       </w:pPr>
       <w:r>
         <w:t>7 Terms</w:t>
@@ -919,6 +1075,8 @@
     <w:p>
       <w:pPr>
         <w:pStyle w:val="ListBullet"/>
+        <w:keepNext/>
+        <w:keepLines/>
       </w:pPr>
       <w:r>
         <w:t>Quotation valid for 90 days from the date above</w:t>
@@ -927,6 +1085,8 @@
     <w:p>
       <w:pPr>
         <w:pStyle w:val="ListBullet"/>
+        <w:keepNext/>
+        <w:keepLines/>
       </w:pPr>
       <w:r>
         <w:t>Invoiced in full on issue of the final report; payment within 30 days</w:t>
@@ -935,6 +1095,8 @@
     <w:p>
       <w:pPr>
         <w:pStyle w:val="ListBullet"/>
+        <w:keepNext/>
+        <w:keepLines/>
       </w:pPr>
       <w:r>
         <w:t>Unused compound returned or destroyed at the client's instruction</w:t>
@@ -943,6 +1105,7 @@
     <w:p>
       <w:pPr>
         <w:pStyle w:val="ListBullet"/>
+        <w:keepLines/>
       </w:pPr>
       <w:r>
         <w:t>Data and samples retained for 5 years</w:t>
@@ -1030,11 +1193,38 @@
           </w:tcPr>
           <w:p>
             <w:r>
-              <w:rPr>
-                <w:rFonts w:ascii="Georgia" w:hAnsi="Georgia"/>
-                <w:i/>
-              </w:rPr>
-              <w:t>Benmezroun</w:t>
+              <w:drawing>
+                <wp:inline xmlns:a="http://schemas.openxmlformats.org/drawingml/2006/main" xmlns:pic="http://schemas.openxmlformats.org/drawingml/2006/picture">
+                  <wp:extent cx="1213714" cy="324000"/>
+                  <wp:docPr id="1" name="Picture 1"/>
+                  <wp:cNvGraphicFramePr>
+                    <a:graphicFrameLocks noChangeAspect="1"/>
+                  </wp:cNvGraphicFramePr>
+                  <a:graphic>
+                    <a:graphicData uri="http://schemas.openxmlformats.org/drawingml/2006/picture">
+                      <pic:pic>
+                        <pic:nvPicPr>
+                          <pic:cNvPr id="0" name="image.png"/>
+                          <pic:cNvPicPr/>
+                        </pic:nvPicPr>
+                        <pic:blipFill>
+                          <a:blip r:embed="rId11"/>
+                          <a:stretch>
+                            <a:fillRect/>
+                          </a:stretch>
+                        </pic:blipFill>
+                        <pic:spPr>
+                          <a:xfrm>
+                            <a:off x="0" y="0"/>
+                            <a:ext cx="1213714" cy="324000"/>
+                          </a:xfrm>
+                          <a:prstGeom prst="rect"/>
+                        </pic:spPr>
+                      </pic:pic>
+                    </a:graphicData>
+                  </a:graphic>
+                </wp:inline>
+              </w:drawing>
             </w:r>
           </w:p>
         </w:tc>

</xml_diff>